<commit_message>
Reframe session exercises as in-session (not take-home)
Both exercises now read as live, in-class work: follow-along with the demo, a
short solo 'your turn', then regroup together. Own-data practice is the only
optional, after-class item.

Co-Authored-By: Claude Opus 4.8 <noreply@anthropic.com>
</commit_message>
<xml_diff>
--- a/Session 1 - The Modern Excel + AI Landscape/Exercise.docx
+++ b/Session 1 - The Modern Excel + AI Landscape/Exercise.docx
@@ -13,7 +13,7 @@
           <w:color w:val="6FA63C"/>
           <w:sz w:val="22"/>
         </w:rPr>
-        <w:t>SESSION 1 EXERCISE</w:t>
+        <w:t>SESSION 1 IN-SESSION EXERCISE</w:t>
       </w:r>
     </w:p>
     <w:p>
@@ -27,7 +27,7 @@
           <w:color w:val="101110"/>
           <w:sz w:val="44"/>
         </w:rPr>
-        <w:t>Session 1 — Take‑Home Exercise</w:t>
+        <w:t>Session 1 — In‑Session Exercise</w:t>
       </w:r>
     </w:p>
     <w:p>
@@ -49,7 +49,7 @@
           <w:color w:val="101110"/>
           <w:sz w:val="22"/>
         </w:rPr>
-        <w:t>Time:</w:t>
+        <w:t>We do this together, live in class.</w:t>
       </w:r>
       <w:r>
         <w:rPr>
@@ -57,25 +57,13 @@
           <w:color w:val="101110"/>
           <w:sz w:val="22"/>
         </w:rPr>
-        <w:t xml:space="preserve"> about 20 minutes · </w:t>
+        <w:t xml:space="preserve"> Follow along during the demo, take a few minutes on your own, then we regroup and finish it together. Nothing is left for homework.</w:t>
       </w:r>
-      <w:r>
-        <w:rPr>
-          <w:rFonts w:ascii="Calibri" w:hAnsi="Calibri"/>
-          <w:b/>
-          <w:color w:val="101110"/>
-          <w:sz w:val="22"/>
-        </w:rPr>
-        <w:t>Tool:</w:t>
-      </w:r>
-      <w:r>
-        <w:rPr>
-          <w:rFonts w:ascii="Calibri" w:hAnsi="Calibri"/>
-          <w:color w:val="101110"/>
-          <w:sz w:val="22"/>
-        </w:rPr>
-        <w:t xml:space="preserve"> Power Query </w:t>
-      </w:r>
+    </w:p>
+    <w:p>
+      <w:pPr>
+        <w:spacing w:after="120"/>
+      </w:pPr>
       <w:r>
         <w:rPr>
           <w:rFonts w:ascii="Calibri" w:hAnsi="Calibri"/>
@@ -112,19 +100,6 @@
     </w:p>
     <w:p>
       <w:pPr>
-        <w:spacing w:after="120"/>
-      </w:pPr>
-      <w:r>
-        <w:rPr>
-          <w:rFonts w:ascii="Calibri" w:hAnsi="Calibri"/>
-          <w:color w:val="101110"/>
-          <w:sz w:val="22"/>
-        </w:rPr>
-        <w:t>This is just the clean we did together in class — now on your own, start to finish. Same file, same steps. Nothing new.</w:t>
-      </w:r>
-    </w:p>
-    <w:p>
-      <w:pPr>
         <w:spacing w:before="200" w:after="60"/>
       </w:pPr>
       <w:r>
@@ -134,7 +109,7 @@
           <w:color w:val="101110"/>
           <w:sz w:val="30"/>
         </w:rPr>
-        <w:t>What to do</w:t>
+        <w:t>Follow along (with the instructor)</w:t>
       </w:r>
     </w:p>
     <w:p>
@@ -147,7 +122,7 @@
           <w:color w:val="101110"/>
           <w:sz w:val="22"/>
         </w:rPr>
-        <w:t>Open the file in Power Query and run the same steps we did in class:</w:t>
+        <w:t>As we go, do these with me in Power Query:</w:t>
       </w:r>
     </w:p>
     <w:p>
@@ -163,7 +138,7 @@
           <w:color w:val="101110"/>
           <w:sz w:val="22"/>
         </w:rPr>
-        <w:t>Connect</w:t>
+        <w:t>Connect:</w:t>
       </w:r>
       <w:r>
         <w:rPr>
@@ -171,7 +146,7 @@
           <w:color w:val="101110"/>
           <w:sz w:val="22"/>
         </w:rPr>
-        <w:t xml:space="preserve"> (Get Data ▸ From Text/CSV ▸ Transform Data).</w:t>
+        <w:t xml:space="preserve"> Get Data ▸ From Text/CSV ▸ Transform Data.</w:t>
       </w:r>
     </w:p>
     <w:p>
@@ -260,7 +235,7 @@
           <w:color w:val="101110"/>
           <w:sz w:val="22"/>
         </w:rPr>
-        <w:t xml:space="preserve"> remove </w:t>
+        <w:t xml:space="preserve"> Replace Values to remove </w:t>
       </w:r>
       <w:r>
         <w:rPr>
@@ -292,12 +267,56 @@
           <w:color w:val="101110"/>
           <w:sz w:val="22"/>
         </w:rPr>
-        <w:t>, then change the type to a number.</w:t>
+        <w:t>, then Change Type → Decimal Number.</w:t>
       </w:r>
     </w:p>
     <w:p>
       <w:pPr>
-        <w:pStyle w:val="ListNumber"/>
+        <w:spacing w:before="200" w:after="60"/>
+      </w:pPr>
+      <w:r>
+        <w:rPr>
+          <w:rFonts w:ascii="Calibri" w:hAnsi="Calibri"/>
+          <w:b/>
+          <w:color w:val="101110"/>
+          <w:sz w:val="30"/>
+        </w:rPr>
+        <w:t>Your turn (a few minutes, on your own)</w:t>
+      </w:r>
+    </w:p>
+    <w:p>
+      <w:pPr>
+        <w:spacing w:after="120"/>
+      </w:pPr>
+      <w:r>
+        <w:rPr>
+          <w:rFonts w:ascii="Calibri" w:hAnsi="Calibri"/>
+          <w:color w:val="101110"/>
+          <w:sz w:val="22"/>
+        </w:rPr>
+        <w:t xml:space="preserve">Fix the </w:t>
+      </w:r>
+      <w:r>
+        <w:rPr>
+          <w:rFonts w:ascii="Calibri" w:hAnsi="Calibri"/>
+          <w:b/>
+          <w:color w:val="101110"/>
+          <w:sz w:val="22"/>
+        </w:rPr>
+        <w:t>Quantity</w:t>
+      </w:r>
+      <w:r>
+        <w:rPr>
+          <w:rFonts w:ascii="Calibri" w:hAnsi="Calibri"/>
+          <w:color w:val="101110"/>
+          <w:sz w:val="22"/>
+        </w:rPr>
+        <w:t xml:space="preserve"> column the same way we just did Revenue:</w:t>
+      </w:r>
+    </w:p>
+    <w:p>
+      <w:pPr>
+        <w:pStyle w:val="ListBullet"/>
         <w:spacing w:after="40"/>
         <w:ind w:left="432" w:hanging="259"/>
       </w:pPr>
@@ -308,32 +327,22 @@
           <w:color w:val="101110"/>
           <w:sz w:val="22"/>
         </w:rPr>
-        <w:t>Fix Quantity:</w:t>
+        <w:t>Change Type → Whole Number</w:t>
       </w:r>
+    </w:p>
+    <w:p>
+      <w:pPr>
+        <w:pStyle w:val="ListBullet"/>
+        <w:spacing w:after="40"/>
+        <w:ind w:left="432" w:hanging="259"/>
+      </w:pPr>
       <w:r>
         <w:rPr>
           <w:rFonts w:ascii="Calibri" w:hAnsi="Calibri"/>
           <w:color w:val="101110"/>
           <w:sz w:val="22"/>
         </w:rPr>
-        <w:t xml:space="preserve"> change to a whole number; </w:t>
-      </w:r>
-      <w:r>
-        <w:rPr>
-          <w:rFonts w:ascii="Calibri" w:hAnsi="Calibri"/>
-          <w:b/>
-          <w:color w:val="101110"/>
-          <w:sz w:val="22"/>
-        </w:rPr>
-        <w:t>Remove Errors</w:t>
-      </w:r>
-      <w:r>
-        <w:rPr>
-          <w:rFonts w:ascii="Calibri" w:hAnsi="Calibri"/>
-          <w:color w:val="101110"/>
-          <w:sz w:val="22"/>
-        </w:rPr>
-        <w:t xml:space="preserve"> for the </w:t>
+        <w:t xml:space="preserve">One cell says </w:t>
       </w:r>
       <w:r>
         <w:rPr>
@@ -349,15 +358,8 @@
           <w:color w:val="101110"/>
           <w:sz w:val="22"/>
         </w:rPr>
-        <w:t xml:space="preserve"> cell.</w:t>
+        <w:t xml:space="preserve"> and will error → </w:t>
       </w:r>
-    </w:p>
-    <w:p>
-      <w:pPr>
-        <w:pStyle w:val="ListNumber"/>
-        <w:spacing w:after="40"/>
-        <w:ind w:left="432" w:hanging="259"/>
-      </w:pPr>
       <w:r>
         <w:rPr>
           <w:rFonts w:ascii="Calibri" w:hAnsi="Calibri"/>
@@ -365,7 +367,7 @@
           <w:color w:val="101110"/>
           <w:sz w:val="22"/>
         </w:rPr>
-        <w:t>Close &amp; Load.</w:t>
+        <w:t>Remove Errors</w:t>
       </w:r>
     </w:p>
     <w:p>
@@ -378,7 +380,34 @@
           <w:color w:val="101110"/>
           <w:sz w:val="22"/>
         </w:rPr>
-        <w:t>That's it. If you remember a step we did for duplicates or the TOTAL row, do that too — but the six steps above are the assignment.</w:t>
+        <w:t>That's the whole task — same moves, smaller bite. Don't worry if you get stuck.</w:t>
+      </w:r>
+    </w:p>
+    <w:p>
+      <w:pPr>
+        <w:spacing w:before="200" w:after="60"/>
+      </w:pPr>
+      <w:r>
+        <w:rPr>
+          <w:rFonts w:ascii="Calibri" w:hAnsi="Calibri"/>
+          <w:b/>
+          <w:color w:val="101110"/>
+          <w:sz w:val="30"/>
+        </w:rPr>
+        <w:t>We regroup</w:t>
+      </w:r>
+    </w:p>
+    <w:p>
+      <w:pPr>
+        <w:spacing w:after="120"/>
+      </w:pPr>
+      <w:r>
+        <w:rPr>
+          <w:rFonts w:ascii="Calibri" w:hAnsi="Calibri"/>
+          <w:color w:val="101110"/>
+          <w:sz w:val="22"/>
+        </w:rPr>
+        <w:t>We'll do the Quantity column together and check it. Your row count should drop by one.</w:t>
       </w:r>
     </w:p>
     <w:p>
@@ -397,9 +426,7 @@
     </w:p>
     <w:p>
       <w:pPr>
-        <w:pStyle w:val="ListBullet"/>
-        <w:spacing w:after="40"/>
-        <w:ind w:left="432" w:hanging="259"/>
+        <w:spacing w:after="120"/>
       </w:pPr>
       <w:r>
         <w:rPr>
@@ -407,7 +434,7 @@
           <w:color w:val="101110"/>
           <w:sz w:val="22"/>
         </w:rPr>
-        <w:t xml:space="preserve">Around </w:t>
+        <w:t xml:space="preserve">After the full clean (which we finish together): about </w:t>
       </w:r>
       <w:r>
         <w:rPr>
@@ -424,22 +451,7 @@
           <w:color w:val="101110"/>
           <w:sz w:val="22"/>
         </w:rPr>
-        <w:t>.</w:t>
-      </w:r>
-    </w:p>
-    <w:p>
-      <w:pPr>
-        <w:pStyle w:val="ListBullet"/>
-        <w:spacing w:after="40"/>
-        <w:ind w:left="432" w:hanging="259"/>
-      </w:pPr>
-      <w:r>
-        <w:rPr>
-          <w:rFonts w:ascii="Calibri" w:hAnsi="Calibri"/>
-          <w:color w:val="101110"/>
-          <w:sz w:val="22"/>
-        </w:rPr>
-        <w:t xml:space="preserve">Total </w:t>
+        <w:t xml:space="preserve">, total </w:t>
       </w:r>
       <w:r>
         <w:rPr>
@@ -461,35 +473,6 @@
     </w:p>
     <w:p>
       <w:pPr>
-        <w:spacing w:after="120"/>
-      </w:pPr>
-      <w:r>
-        <w:rPr>
-          <w:rFonts w:ascii="Calibri" w:hAnsi="Calibri"/>
-          <w:color w:val="101110"/>
-          <w:sz w:val="22"/>
-        </w:rPr>
-        <w:t xml:space="preserve">Stuck on a step? The walkthrough is in </w:t>
-      </w:r>
-      <w:r>
-        <w:rPr>
-          <w:rFonts w:ascii="Consolas" w:hAnsi="Consolas"/>
-          <w:color w:val="333333"/>
-          <w:sz w:val="22"/>
-        </w:rPr>
-        <w:t>Instructor Notes / Session 1 - Solution (Power Query)</w:t>
-      </w:r>
-      <w:r>
-        <w:rPr>
-          <w:rFonts w:ascii="Calibri" w:hAnsi="Calibri"/>
-          <w:color w:val="101110"/>
-          <w:sz w:val="22"/>
-        </w:rPr>
-        <w:t xml:space="preserve"> — try first, peek second.</w:t>
-      </w:r>
-    </w:p>
-    <w:p>
-      <w:pPr>
         <w:spacing w:before="200" w:after="60"/>
       </w:pPr>
       <w:r>
@@ -499,7 +482,7 @@
           <w:color w:val="101110"/>
           <w:sz w:val="30"/>
         </w:rPr>
-        <w:t>Share (required)</w:t>
+        <w:t>Optional, anytime after class</w:t>
       </w:r>
     </w:p>
     <w:p>
@@ -512,51 +495,7 @@
           <w:color w:val="101110"/>
           <w:sz w:val="22"/>
         </w:rPr>
-        <w:t xml:space="preserve">Post a screenshot of your cleaned table's </w:t>
-      </w:r>
-      <w:r>
-        <w:rPr>
-          <w:rFonts w:ascii="Calibri" w:hAnsi="Calibri"/>
-          <w:b/>
-          <w:color w:val="101110"/>
-          <w:sz w:val="22"/>
-        </w:rPr>
-        <w:t>row count and total</w:t>
-      </w:r>
-      <w:r>
-        <w:rPr>
-          <w:rFonts w:ascii="Calibri" w:hAnsi="Calibri"/>
-          <w:color w:val="101110"/>
-          <w:sz w:val="22"/>
-        </w:rPr>
-        <w:t xml:space="preserve"> in the Slack channel.</w:t>
-      </w:r>
-    </w:p>
-    <w:p>
-      <w:pPr>
-        <w:spacing w:before="200" w:after="60"/>
-      </w:pPr>
-      <w:r>
-        <w:rPr>
-          <w:rFonts w:ascii="Calibri" w:hAnsi="Calibri"/>
-          <w:b/>
-          <w:color w:val="101110"/>
-          <w:sz w:val="30"/>
-        </w:rPr>
-        <w:t>Optional (only if you want to)</w:t>
-      </w:r>
-    </w:p>
-    <w:p>
-      <w:pPr>
-        <w:spacing w:after="120"/>
-      </w:pPr>
-      <w:r>
-        <w:rPr>
-          <w:rFonts w:ascii="Calibri" w:hAnsi="Calibri"/>
-          <w:color w:val="101110"/>
-          <w:sz w:val="22"/>
-        </w:rPr>
-        <w:t>Try the same six steps on a small, anonymized sample of your own messy data, and bring one question to Session 2. Completely optional.</w:t>
+        <w:t>If you'd like, try the same steps on a small, anonymized sample of your own messy data. Completely optional — not required.</w:t>
       </w:r>
     </w:p>
     <w:p>
@@ -573,7 +512,7 @@
           <w:color w:val="3A3D38"/>
           <w:sz w:val="22"/>
         </w:rPr>
-        <w:t>Keep confidential data out of public AI tools unless your organization has approved them. A few sample rows is plenty.</w:t>
+        <w:t>Keep confidential data out of public AI tools unless your organization has approved them.</w:t>
       </w:r>
     </w:p>
     <w:sectPr>

</xml_diff>